<commit_message>
Tabela 5: usa estilo Legenda/Caption no titulo (funcao de legenda do Word)
Co-Authored-By: Claude Opus 4.8 <noreply@anthropic.com>
Claude-Session: https://claude.ai/code/session_01RiBxk7VWFWAPqjYN9jBWji
</commit_message>
<xml_diff>
--- a/TR_Tabela5_Agrupados_Discriminada.docx
+++ b/TR_Tabela5_Agrupados_Discriminada.docx
@@ -4,10 +4,10 @@
   <w:body>
     <w:p>
       <w:pPr>
-        <w:pStyle w:val="Heading2"/>
+        <w:pStyle w:val="Caption"/>
       </w:pPr>
       <w:r>
-        <w:t>Tabela 5 – PGRS agrupados (18 planos, 160 unidades)</w:t>
+        <w:t>Tabela 5 – PGRS agrupados (18 planos, cobrindo 160 unidades).</w:t>
       </w:r>
     </w:p>
     <w:tbl>

</xml_diff>

<commit_message>
Corrige SUP das unidades pelo KML oficial (sobreposicao espacial); tabela e mapa sincronizados
- Join espacial dos 179 pontos nos poligonos oficiais (RJ Superintendencias.kml)
- ~13 unidades Zona Norte movidas Centro-Sul -> Rio Norte (AG-02 -> AG-03); 2 individuais relabel
- Regra: SUPs do Rio usam area 'RJ - Capital' (elimina orfao de divisa - Jardim America)
- Agrupados: SEGUEM 18 (contagem nao muda); Paqueta SEGURADO (Leste/Norte a definir)
- Tabela 5 discriminada regenerada com nota do Paqueta

Co-Authored-By: Claude Opus 4.8 <noreply@anthropic.com>
Claude-Session: https://claude.ai/code/session_01RiBxk7VWFWAPqjYN9jBWji
</commit_message>
<xml_diff>
--- a/TR_Tabela5_Agrupados_Discriminada.docx
+++ b/TR_Tabela5_Agrupados_Discriminada.docx
@@ -230,7 +230,7 @@
                 <w:b w:val="0"/>
                 <w:sz w:val="18"/>
               </w:rPr>
-              <w:t>20</w:t>
+              <w:t>10</w:t>
             </w:r>
           </w:p>
         </w:tc>
@@ -244,7 +244,7 @@
                 <w:b w:val="0"/>
                 <w:sz w:val="18"/>
               </w:rPr>
-              <w:t>Base Operacional Maré; Base VCG São Cristovão; EEAT Maracanã; EEE Bica; EEE Faria Timbó; EEE Fundão; EEE Paquetá; EEE Paranapuã; EEE São Bento; EEE Zumbi I; Estação Elevatória de Esgoto Paquetá 5; Loja de Atendimento Campinho; Loja de Atendimento Ilha do Governador; Loja de Atendimento Méier; Loja de Atendimento Tijuca; Reservatório Francisco Sá; Reservatório Guaicurus; Reservatório Pedregulho; Reservatório do França; UT Afonso Viseu</w:t>
+              <w:t>Base VCG São Cristovão; EEAT Maracanã; EEE Paquetá *; Estação Elevatória de Esgoto Paquetá 5 *; Loja de Atendimento Tijuca; Reservatório Francisco Sá; Reservatório Guaicurus; Reservatório Pedregulho; Reservatório do França; UT Afonso Viseu</w:t>
             </w:r>
           </w:p>
         </w:tc>
@@ -302,7 +302,7 @@
                 <w:b w:val="0"/>
                 <w:sz w:val="18"/>
               </w:rPr>
-              <w:t>3</w:t>
+              <w:t>14</w:t>
             </w:r>
           </w:p>
         </w:tc>
@@ -316,7 +316,7 @@
                 <w:b w:val="0"/>
                 <w:sz w:val="18"/>
               </w:rPr>
-              <w:t>Base EEAT Juramento; Base Operacional Ilha do Governador; Base VCG Bonsucesso</w:t>
+              <w:t>Base EEAT Juramento; Base Operacional Ilha do Governador; Base Operacional Maré; Base VCG Bonsucesso; Base VCG Jardim América; EEE Bica; EEE Faria Timbó; EEE Fundão; EEE Paranapuã; EEE São Bento; EEE Zumbi I; Loja de Atendimento Campinho; Loja de Atendimento Ilha do Governador; Loja de Atendimento Méier</w:t>
             </w:r>
           </w:p>
         </w:tc>
@@ -634,6 +634,78 @@
                 <w:b w:val="0"/>
                 <w:sz w:val="18"/>
               </w:rPr>
+              <w:t>São João de Meriti — Baixada 1</w:t>
+            </w:r>
+          </w:p>
+        </w:tc>
+        <w:tc>
+          <w:tcPr>
+            <w:tcW w:type="dxa" w:w="680"/>
+          </w:tcPr>
+          <w:p>
+            <w:r>
+              <w:rPr>
+                <w:b w:val="0"/>
+                <w:sz w:val="18"/>
+              </w:rPr>
+              <w:t>B4</w:t>
+            </w:r>
+          </w:p>
+        </w:tc>
+        <w:tc>
+          <w:tcPr>
+            <w:tcW w:type="dxa" w:w="567"/>
+          </w:tcPr>
+          <w:p>
+            <w:r>
+              <w:rPr>
+                <w:b w:val="0"/>
+                <w:sz w:val="18"/>
+              </w:rPr>
+              <w:t>2</w:t>
+            </w:r>
+          </w:p>
+        </w:tc>
+        <w:tc>
+          <w:tcPr>
+            <w:tcW w:type="dxa" w:w="5669"/>
+          </w:tcPr>
+          <w:p>
+            <w:r>
+              <w:rPr>
+                <w:b w:val="0"/>
+                <w:sz w:val="18"/>
+              </w:rPr>
+              <w:t>Reservatório Coelho da Rocha; Sede Sao Joao de Meriti</w:t>
+            </w:r>
+          </w:p>
+        </w:tc>
+      </w:tr>
+      <w:tr>
+        <w:tc>
+          <w:tcPr>
+            <w:tcW w:type="dxa" w:w="1191"/>
+          </w:tcPr>
+          <w:p>
+            <w:r>
+              <w:rPr>
+                <w:b/>
+                <w:sz w:val="18"/>
+              </w:rPr>
+              <w:t>PGRS-AG-09</w:t>
+            </w:r>
+          </w:p>
+        </w:tc>
+        <w:tc>
+          <w:tcPr>
+            <w:tcW w:type="dxa" w:w="2608"/>
+          </w:tcPr>
+          <w:p>
+            <w:r>
+              <w:rPr>
+                <w:b w:val="0"/>
+                <w:sz w:val="18"/>
+              </w:rPr>
               <w:t>Belford Roxo — Baixada 1</w:t>
             </w:r>
           </w:p>
@@ -692,78 +764,6 @@
                 <w:b/>
                 <w:sz w:val="18"/>
               </w:rPr>
-              <w:t>PGRS-AG-09</w:t>
-            </w:r>
-          </w:p>
-        </w:tc>
-        <w:tc>
-          <w:tcPr>
-            <w:tcW w:type="dxa" w:w="2608"/>
-          </w:tcPr>
-          <w:p>
-            <w:r>
-              <w:rPr>
-                <w:b w:val="0"/>
-                <w:sz w:val="18"/>
-              </w:rPr>
-              <w:t>São João de Meriti — Baixada 1</w:t>
-            </w:r>
-          </w:p>
-        </w:tc>
-        <w:tc>
-          <w:tcPr>
-            <w:tcW w:type="dxa" w:w="680"/>
-          </w:tcPr>
-          <w:p>
-            <w:r>
-              <w:rPr>
-                <w:b w:val="0"/>
-                <w:sz w:val="18"/>
-              </w:rPr>
-              <w:t>B4</w:t>
-            </w:r>
-          </w:p>
-        </w:tc>
-        <w:tc>
-          <w:tcPr>
-            <w:tcW w:type="dxa" w:w="567"/>
-          </w:tcPr>
-          <w:p>
-            <w:r>
-              <w:rPr>
-                <w:b w:val="0"/>
-                <w:sz w:val="18"/>
-              </w:rPr>
-              <w:t>2</w:t>
-            </w:r>
-          </w:p>
-        </w:tc>
-        <w:tc>
-          <w:tcPr>
-            <w:tcW w:type="dxa" w:w="5669"/>
-          </w:tcPr>
-          <w:p>
-            <w:r>
-              <w:rPr>
-                <w:b w:val="0"/>
-                <w:sz w:val="18"/>
-              </w:rPr>
-              <w:t>Reservatório Coelho da Rocha; Sede Sao Joao de Meriti</w:t>
-            </w:r>
-          </w:p>
-        </w:tc>
-      </w:tr>
-      <w:tr>
-        <w:tc>
-          <w:tcPr>
-            <w:tcW w:type="dxa" w:w="1191"/>
-          </w:tcPr>
-          <w:p>
-            <w:r>
-              <w:rPr>
-                <w:b/>
-                <w:sz w:val="18"/>
-              </w:rPr>
               <w:t>PGRS-AG-10</w:t>
             </w:r>
           </w:p>
@@ -806,7 +806,7 @@
                 <w:b w:val="0"/>
                 <w:sz w:val="18"/>
               </w:rPr>
-              <w:t>9</w:t>
+              <w:t>8</w:t>
             </w:r>
           </w:p>
         </w:tc>
@@ -820,7 +820,7 @@
                 <w:b w:val="0"/>
                 <w:sz w:val="18"/>
               </w:rPr>
-              <w:t>Base VCG Jardim América; Booster Belford Roxo; CL Duque de Caxias; EEE Jardim Gramacho; EEE Tião Lante; Reservatório 25 de Agosto; Reservatório Centenário; Sede Caxias; Sede Jardim Primavera</w:t>
+              <w:t>Booster Belford Roxo; CL Duque de Caxias; EEE Jardim Gramacho; EEE Tião Lante; Reservatório 25 de Agosto; Reservatório Centenário; Sede Caxias; Sede Jardim Primavera</w:t>
             </w:r>
           </w:p>
         </w:tc>
@@ -1473,6 +1473,15 @@
         </w:tc>
       </w:tr>
     </w:tbl>
+    <w:p>
+      <w:r>
+        <w:rPr>
+          <w:i/>
+          <w:sz w:val="16"/>
+        </w:rPr>
+        <w:t>* Paquetá (EEE Paquetá e EEE Paquetá 5): superintendência a definir (Leste ou Rio Norte); listada provisoriamente no AG-02.</w:t>
+      </w:r>
+    </w:p>
     <w:sectPr>
       <w:pgSz w:w="12240" w:h="15840"/>
       <w:pgMar w:top="1440" w:right="1800" w:bottom="1440" w:left="1800" w:header="720" w:footer="720" w:gutter="0"/>

</xml_diff>

<commit_message>
Paqueta = unica excecao de bloco: entra no Leste Metropolitano (AG-06 B1) -> 36 PGRS (18+18)
- Mapa/estilo/tabela/Fase1 sincronizados; AG-06 vira B1 e B4 com nota da excecao; Fase1 volta a 36 visitas

Co-Authored-By: Claude Opus 4.8 <noreply@anthropic.com>
Claude-Session: https://claude.ai/code/session_01RiBxk7VWFWAPqjYN9jBWji
</commit_message>
<xml_diff>
--- a/TR_Tabela5_Agrupados_Discriminada.docx
+++ b/TR_Tabela5_Agrupados_Discriminada.docx
@@ -7,7 +7,7 @@
         <w:pStyle w:val="Caption"/>
       </w:pPr>
       <w:r>
-        <w:t>Tabela 5 – PGRS agrupados (19 planos, cobrindo 160 unidades).</w:t>
+        <w:t>Tabela 5 – PGRS agrupados (18 planos, cobrindo 160 unidades).</w:t>
       </w:r>
     </w:p>
     <w:tbl>
@@ -58,7 +58,7 @@
         </w:tc>
         <w:tc>
           <w:tcPr>
-            <w:tcW w:type="dxa" w:w="680"/>
+            <w:tcW w:type="dxa" w:w="737"/>
             <w:shd w:val="clear" w:fill="1F6FB0"/>
           </w:tcPr>
           <w:p>
@@ -90,7 +90,7 @@
         </w:tc>
         <w:tc>
           <w:tcPr>
-            <w:tcW w:type="dxa" w:w="5669"/>
+            <w:tcW w:type="dxa" w:w="5613"/>
             <w:shd w:val="clear" w:fill="1F6FB0"/>
           </w:tcPr>
           <w:p>
@@ -136,7 +136,7 @@
         </w:tc>
         <w:tc>
           <w:tcPr>
-            <w:tcW w:type="dxa" w:w="680"/>
+            <w:tcW w:type="dxa" w:w="737"/>
           </w:tcPr>
           <w:p>
             <w:r>
@@ -164,7 +164,7 @@
         </w:tc>
         <w:tc>
           <w:tcPr>
-            <w:tcW w:type="dxa" w:w="5669"/>
+            <w:tcW w:type="dxa" w:w="5613"/>
           </w:tcPr>
           <w:p>
             <w:r>
@@ -208,7 +208,7 @@
         </w:tc>
         <w:tc>
           <w:tcPr>
-            <w:tcW w:type="dxa" w:w="680"/>
+            <w:tcW w:type="dxa" w:w="737"/>
           </w:tcPr>
           <w:p>
             <w:r>
@@ -236,7 +236,7 @@
         </w:tc>
         <w:tc>
           <w:tcPr>
-            <w:tcW w:type="dxa" w:w="5669"/>
+            <w:tcW w:type="dxa" w:w="5613"/>
           </w:tcPr>
           <w:p>
             <w:r>
@@ -280,7 +280,7 @@
         </w:tc>
         <w:tc>
           <w:tcPr>
-            <w:tcW w:type="dxa" w:w="680"/>
+            <w:tcW w:type="dxa" w:w="737"/>
           </w:tcPr>
           <w:p>
             <w:r>
@@ -308,7 +308,7 @@
         </w:tc>
         <w:tc>
           <w:tcPr>
-            <w:tcW w:type="dxa" w:w="5669"/>
+            <w:tcW w:type="dxa" w:w="5613"/>
           </w:tcPr>
           <w:p>
             <w:r>
@@ -352,7 +352,7 @@
         </w:tc>
         <w:tc>
           <w:tcPr>
-            <w:tcW w:type="dxa" w:w="680"/>
+            <w:tcW w:type="dxa" w:w="737"/>
           </w:tcPr>
           <w:p>
             <w:r>
@@ -380,7 +380,7 @@
         </w:tc>
         <w:tc>
           <w:tcPr>
-            <w:tcW w:type="dxa" w:w="5669"/>
+            <w:tcW w:type="dxa" w:w="5613"/>
           </w:tcPr>
           <w:p>
             <w:r>
@@ -424,7 +424,7 @@
         </w:tc>
         <w:tc>
           <w:tcPr>
-            <w:tcW w:type="dxa" w:w="680"/>
+            <w:tcW w:type="dxa" w:w="737"/>
           </w:tcPr>
           <w:p>
             <w:r>
@@ -452,7 +452,7 @@
         </w:tc>
         <w:tc>
           <w:tcPr>
-            <w:tcW w:type="dxa" w:w="5669"/>
+            <w:tcW w:type="dxa" w:w="5613"/>
           </w:tcPr>
           <w:p>
             <w:r>
@@ -496,7 +496,7 @@
         </w:tc>
         <w:tc>
           <w:tcPr>
-            <w:tcW w:type="dxa" w:w="680"/>
+            <w:tcW w:type="dxa" w:w="737"/>
           </w:tcPr>
           <w:p>
             <w:r>
@@ -504,7 +504,7 @@
                 <w:b w:val="0"/>
                 <w:sz w:val="18"/>
               </w:rPr>
-              <w:t>B1</w:t>
+              <w:t>B1 e B4</w:t>
             </w:r>
           </w:p>
         </w:tc>
@@ -518,13 +518,13 @@
                 <w:b w:val="0"/>
                 <w:sz w:val="18"/>
               </w:rPr>
-              <w:t>17</w:t>
+              <w:t>19</w:t>
             </w:r>
           </w:p>
         </w:tc>
         <w:tc>
           <w:tcPr>
-            <w:tcW w:type="dxa" w:w="5669"/>
+            <w:tcW w:type="dxa" w:w="5613"/>
           </w:tcPr>
           <w:p>
             <w:r>
@@ -532,7 +532,7 @@
                 <w:b w:val="0"/>
                 <w:sz w:val="18"/>
               </w:rPr>
-              <w:t>Base Operacional Itaboraí; Base VCG São Gonçalo; EEAT Inoã; EEE Apolo 1; EEE Mário Quintão; EEE Paul Leroux; ETA Manilha; ETA Marambaia; ETA Porto das Caixas; ETA Rio Caceribu; ETE Apolo; ETE Grande Rio 1; ETE Jardim Catarina; ETE Pinhão; Loja Comercial São Gonçalo; Loja Comercial Tanguá; Sede Admnistrativa Centro I</w:t>
+              <w:t>Base Operacional Itaboraí; Base VCG São Gonçalo; EEAT Inoã; EEE Apolo 1; EEE Mário Quintão; EEE Paquetá *; EEE Paul Leroux; ETA Manilha; ETA Marambaia; ETA Porto das Caixas; ETA Rio Caceribu; ETE Apolo; ETE Grande Rio 1; ETE Jardim Catarina; ETE Pinhão; Estação Elevatória de Esgoto Paquetá 5 *; Loja Comercial São Gonçalo; Loja Comercial Tanguá; Sede Admnistrativa Centro I</w:t>
             </w:r>
           </w:p>
         </w:tc>
@@ -562,13 +562,13 @@
                 <w:b w:val="0"/>
                 <w:sz w:val="18"/>
               </w:rPr>
-              <w:t>Rio de Janeiro – Leste</w:t>
+              <w:t>Magé — Baixada 1</w:t>
             </w:r>
           </w:p>
         </w:tc>
         <w:tc>
           <w:tcPr>
-            <w:tcW w:type="dxa" w:w="680"/>
+            <w:tcW w:type="dxa" w:w="737"/>
           </w:tcPr>
           <w:p>
             <w:r>
@@ -576,7 +576,7 @@
                 <w:b w:val="0"/>
                 <w:sz w:val="18"/>
               </w:rPr>
-              <w:t>B4</w:t>
+              <w:t>B1</w:t>
             </w:r>
           </w:p>
         </w:tc>
@@ -590,13 +590,13 @@
                 <w:b w:val="0"/>
                 <w:sz w:val="18"/>
               </w:rPr>
-              <w:t>2</w:t>
+              <w:t>3</w:t>
             </w:r>
           </w:p>
         </w:tc>
         <w:tc>
           <w:tcPr>
-            <w:tcW w:type="dxa" w:w="5669"/>
+            <w:tcW w:type="dxa" w:w="5613"/>
           </w:tcPr>
           <w:p>
             <w:r>
@@ -604,7 +604,7 @@
                 <w:b w:val="0"/>
                 <w:sz w:val="18"/>
               </w:rPr>
-              <w:t>EEE Paquetá; Estação Elevatória de Esgoto Paquetá 5</w:t>
+              <w:t>ETA Mage; Sede Mage; UT Santo Aleixo</w:t>
             </w:r>
           </w:p>
         </w:tc>
@@ -634,13 +634,13 @@
                 <w:b w:val="0"/>
                 <w:sz w:val="18"/>
               </w:rPr>
-              <w:t>Magé — Baixada 1</w:t>
+              <w:t>Belford Roxo — Baixada 1</w:t>
             </w:r>
           </w:p>
         </w:tc>
         <w:tc>
           <w:tcPr>
-            <w:tcW w:type="dxa" w:w="680"/>
+            <w:tcW w:type="dxa" w:w="737"/>
           </w:tcPr>
           <w:p>
             <w:r>
@@ -648,7 +648,7 @@
                 <w:b w:val="0"/>
                 <w:sz w:val="18"/>
               </w:rPr>
-              <w:t>B1</w:t>
+              <w:t>B4</w:t>
             </w:r>
           </w:p>
         </w:tc>
@@ -662,13 +662,13 @@
                 <w:b w:val="0"/>
                 <w:sz w:val="18"/>
               </w:rPr>
-              <w:t>3</w:t>
+              <w:t>2</w:t>
             </w:r>
           </w:p>
         </w:tc>
         <w:tc>
           <w:tcPr>
-            <w:tcW w:type="dxa" w:w="5669"/>
+            <w:tcW w:type="dxa" w:w="5613"/>
           </w:tcPr>
           <w:p>
             <w:r>
@@ -676,7 +676,7 @@
                 <w:b w:val="0"/>
                 <w:sz w:val="18"/>
               </w:rPr>
-              <w:t>ETA Mage; Sede Mage; UT Santo Aleixo</w:t>
+              <w:t>ETE Sarapui; Sede Belford Roxo</w:t>
             </w:r>
           </w:p>
         </w:tc>
@@ -706,13 +706,13 @@
                 <w:b w:val="0"/>
                 <w:sz w:val="18"/>
               </w:rPr>
-              <w:t>Belford Roxo — Baixada 1</w:t>
+              <w:t>São João de Meriti — Baixada 1</w:t>
             </w:r>
           </w:p>
         </w:tc>
         <w:tc>
           <w:tcPr>
-            <w:tcW w:type="dxa" w:w="680"/>
+            <w:tcW w:type="dxa" w:w="737"/>
           </w:tcPr>
           <w:p>
             <w:r>
@@ -740,7 +740,7 @@
         </w:tc>
         <w:tc>
           <w:tcPr>
-            <w:tcW w:type="dxa" w:w="5669"/>
+            <w:tcW w:type="dxa" w:w="5613"/>
           </w:tcPr>
           <w:p>
             <w:r>
@@ -748,7 +748,7 @@
                 <w:b w:val="0"/>
                 <w:sz w:val="18"/>
               </w:rPr>
-              <w:t>ETE Sarapui; Sede Belford Roxo</w:t>
+              <w:t>Reservatório Coelho da Rocha; Sede Sao Joao de Meriti</w:t>
             </w:r>
           </w:p>
         </w:tc>
@@ -778,13 +778,13 @@
                 <w:b w:val="0"/>
                 <w:sz w:val="18"/>
               </w:rPr>
-              <w:t>São João de Meriti — Baixada 1</w:t>
+              <w:t>Baixada – demais — Baixada 1</w:t>
             </w:r>
           </w:p>
         </w:tc>
         <w:tc>
           <w:tcPr>
-            <w:tcW w:type="dxa" w:w="680"/>
+            <w:tcW w:type="dxa" w:w="737"/>
           </w:tcPr>
           <w:p>
             <w:r>
@@ -806,13 +806,13 @@
                 <w:b w:val="0"/>
                 <w:sz w:val="18"/>
               </w:rPr>
-              <w:t>2</w:t>
+              <w:t>8</w:t>
             </w:r>
           </w:p>
         </w:tc>
         <w:tc>
           <w:tcPr>
-            <w:tcW w:type="dxa" w:w="5669"/>
+            <w:tcW w:type="dxa" w:w="5613"/>
           </w:tcPr>
           <w:p>
             <w:r>
@@ -820,7 +820,7 @@
                 <w:b w:val="0"/>
                 <w:sz w:val="18"/>
               </w:rPr>
-              <w:t>Reservatório Coelho da Rocha; Sede Sao Joao de Meriti</w:t>
+              <w:t>Booster Belford Roxo; CL Duque de Caxias; EEE Jardim Gramacho; EEE Tião Lante; Reservatório 25 de Agosto; Reservatório Centenário; Sede Caxias; Sede Jardim Primavera</w:t>
             </w:r>
           </w:p>
         </w:tc>
@@ -850,13 +850,13 @@
                 <w:b w:val="0"/>
                 <w:sz w:val="18"/>
               </w:rPr>
-              <w:t>Baixada – demais — Baixada 1</w:t>
+              <w:t>Queimados — Baixada 2</w:t>
             </w:r>
           </w:p>
         </w:tc>
         <w:tc>
           <w:tcPr>
-            <w:tcW w:type="dxa" w:w="680"/>
+            <w:tcW w:type="dxa" w:w="737"/>
           </w:tcPr>
           <w:p>
             <w:r>
@@ -878,13 +878,13 @@
                 <w:b w:val="0"/>
                 <w:sz w:val="18"/>
               </w:rPr>
-              <w:t>8</w:t>
+              <w:t>3</w:t>
             </w:r>
           </w:p>
         </w:tc>
         <w:tc>
           <w:tcPr>
-            <w:tcW w:type="dxa" w:w="5669"/>
+            <w:tcW w:type="dxa" w:w="5613"/>
           </w:tcPr>
           <w:p>
             <w:r>
@@ -892,7 +892,7 @@
                 <w:b w:val="0"/>
                 <w:sz w:val="18"/>
               </w:rPr>
-              <w:t>Booster Belford Roxo; CL Duque de Caxias; EEE Jardim Gramacho; EEE Tião Lante; Reservatório 25 de Agosto; Reservatório Centenário; Sede Caxias; Sede Jardim Primavera</w:t>
+              <w:t>ETE Queimados; ETE Sao Jorge; Sede Queimados</w:t>
             </w:r>
           </w:p>
         </w:tc>
@@ -922,13 +922,13 @@
                 <w:b w:val="0"/>
                 <w:sz w:val="18"/>
               </w:rPr>
-              <w:t>Queimados — Baixada 2</w:t>
+              <w:t>Baixada – Nova Iguaçu — Baixada 2</w:t>
             </w:r>
           </w:p>
         </w:tc>
         <w:tc>
           <w:tcPr>
-            <w:tcW w:type="dxa" w:w="680"/>
+            <w:tcW w:type="dxa" w:w="737"/>
           </w:tcPr>
           <w:p>
             <w:r>
@@ -950,13 +950,13 @@
                 <w:b w:val="0"/>
                 <w:sz w:val="18"/>
               </w:rPr>
-              <w:t>3</w:t>
+              <w:t>19</w:t>
             </w:r>
           </w:p>
         </w:tc>
         <w:tc>
           <w:tcPr>
-            <w:tcW w:type="dxa" w:w="5669"/>
+            <w:tcW w:type="dxa" w:w="5613"/>
           </w:tcPr>
           <w:p>
             <w:r>
@@ -964,7 +964,7 @@
                 <w:b w:val="0"/>
                 <w:sz w:val="18"/>
               </w:rPr>
-              <w:t>ETE Queimados; ETE Sao Jorge; Sede Queimados</w:t>
+              <w:t>EEAT Austin; EEAT Cabuçu Alto; EEAT Cabuçu Baixo; EEAT Coordenação de Manutenção da Baixada; EEAT Esplanada; EEAT Floresa Miranda; EEAT Posse; EEE Lagoinha II; ERES Alvorada; ERES Austin; ERES Brasília; ERES Cabuçu Alto; ERES Jk Novo; ERES Jk Velho; ERES Posse; ERES Taça; ETE Lagoinha; Sede Nova Iguaçu; Usina de Asfalto</w:t>
             </w:r>
           </w:p>
         </w:tc>
@@ -994,13 +994,13 @@
                 <w:b w:val="0"/>
                 <w:sz w:val="18"/>
               </w:rPr>
-              <w:t>Baixada – Nova Iguaçu — Baixada 2</w:t>
+              <w:t>Baixada – demais — Baixada 2</w:t>
             </w:r>
           </w:p>
         </w:tc>
         <w:tc>
           <w:tcPr>
-            <w:tcW w:type="dxa" w:w="680"/>
+            <w:tcW w:type="dxa" w:w="737"/>
           </w:tcPr>
           <w:p>
             <w:r>
@@ -1022,13 +1022,13 @@
                 <w:b w:val="0"/>
                 <w:sz w:val="18"/>
               </w:rPr>
-              <w:t>19</w:t>
+              <w:t>9</w:t>
             </w:r>
           </w:p>
         </w:tc>
         <w:tc>
           <w:tcPr>
-            <w:tcW w:type="dxa" w:w="5669"/>
+            <w:tcW w:type="dxa" w:w="5613"/>
           </w:tcPr>
           <w:p>
             <w:r>
@@ -1036,7 +1036,7 @@
                 <w:b w:val="0"/>
                 <w:sz w:val="18"/>
               </w:rPr>
-              <w:t>EEAT Austin; EEAT Cabuçu Alto; EEAT Cabuçu Baixo; EEAT Coordenação de Manutenção da Baixada; EEAT Esplanada; EEAT Floresa Miranda; EEAT Posse; EEE Lagoinha II; ERES Alvorada; ERES Austin; ERES Brasília; ERES Cabuçu Alto; ERES Jk Novo; ERES Jk Velho; ERES Posse; ERES Taça; ETE Lagoinha; Sede Nova Iguaçu; Usina de Asfalto</w:t>
+              <w:t>EEAT Engenheiro Pedreira; EEAT Jk; EEAT Nilópolis; EEE Chatuba; EEE Santo Elias; EEE Vila Norma; ERES Cabral; ERES Engenheiro Pedreira; ERES Nilópolis</w:t>
             </w:r>
           </w:p>
         </w:tc>
@@ -1066,13 +1066,13 @@
                 <w:b w:val="0"/>
                 <w:sz w:val="18"/>
               </w:rPr>
-              <w:t>Baixada – demais — Baixada 2</w:t>
+              <w:t>Cachoeira de Macacu — Interior</w:t>
             </w:r>
           </w:p>
         </w:tc>
         <w:tc>
           <w:tcPr>
-            <w:tcW w:type="dxa" w:w="680"/>
+            <w:tcW w:type="dxa" w:w="737"/>
           </w:tcPr>
           <w:p>
             <w:r>
@@ -1080,7 +1080,7 @@
                 <w:b w:val="0"/>
                 <w:sz w:val="18"/>
               </w:rPr>
-              <w:t>B4</w:t>
+              <w:t>B1</w:t>
             </w:r>
           </w:p>
         </w:tc>
@@ -1094,13 +1094,13 @@
                 <w:b w:val="0"/>
                 <w:sz w:val="18"/>
               </w:rPr>
-              <w:t>9</w:t>
+              <w:t>3</w:t>
             </w:r>
           </w:p>
         </w:tc>
         <w:tc>
           <w:tcPr>
-            <w:tcW w:type="dxa" w:w="5669"/>
+            <w:tcW w:type="dxa" w:w="5613"/>
           </w:tcPr>
           <w:p>
             <w:r>
@@ -1108,7 +1108,7 @@
                 <w:b w:val="0"/>
                 <w:sz w:val="18"/>
               </w:rPr>
-              <w:t>EEAT Engenheiro Pedreira; EEAT Jk; EEAT Nilópolis; EEE Chatuba; EEE Santo Elias; EEE Vila Norma; ERES Cabral; ERES Engenheiro Pedreira; ERES Nilópolis</w:t>
+              <w:t>Loja de Atendimento Cachoeira da Macacu; UT Posto Pena; UT Rio Souza</w:t>
             </w:r>
           </w:p>
         </w:tc>
@@ -1138,13 +1138,13 @@
                 <w:b w:val="0"/>
                 <w:sz w:val="18"/>
               </w:rPr>
-              <w:t>Cachoeira de Macacu — Interior</w:t>
+              <w:t>São Sebastião do Alto — Interior</w:t>
             </w:r>
           </w:p>
         </w:tc>
         <w:tc>
           <w:tcPr>
-            <w:tcW w:type="dxa" w:w="680"/>
+            <w:tcW w:type="dxa" w:w="737"/>
           </w:tcPr>
           <w:p>
             <w:r>
@@ -1166,13 +1166,13 @@
                 <w:b w:val="0"/>
                 <w:sz w:val="18"/>
               </w:rPr>
-              <w:t>3</w:t>
+              <w:t>5</w:t>
             </w:r>
           </w:p>
         </w:tc>
         <w:tc>
           <w:tcPr>
-            <w:tcW w:type="dxa" w:w="5669"/>
+            <w:tcW w:type="dxa" w:w="5613"/>
           </w:tcPr>
           <w:p>
             <w:r>
@@ -1180,7 +1180,7 @@
                 <w:b w:val="0"/>
                 <w:sz w:val="18"/>
               </w:rPr>
-              <w:t>Loja de Atendimento Cachoeira da Macacu; UT Posto Pena; UT Rio Souza</w:t>
+              <w:t>ETA São Sebastião do Alto; ETA Valão do Barro; Loja de Atendimento São Sebastião do Alto; UT Chácara do Paraíso; UT Hospital</w:t>
             </w:r>
           </w:p>
         </w:tc>
@@ -1210,13 +1210,13 @@
                 <w:b w:val="0"/>
                 <w:sz w:val="18"/>
               </w:rPr>
-              <w:t>São Sebastião do Alto — Interior</w:t>
+              <w:t>Lagos e Litoral — Interior</w:t>
             </w:r>
           </w:p>
         </w:tc>
         <w:tc>
           <w:tcPr>
-            <w:tcW w:type="dxa" w:w="680"/>
+            <w:tcW w:type="dxa" w:w="737"/>
           </w:tcPr>
           <w:p>
             <w:r>
@@ -1238,13 +1238,13 @@
                 <w:b w:val="0"/>
                 <w:sz w:val="18"/>
               </w:rPr>
-              <w:t>5</w:t>
+              <w:t>7</w:t>
             </w:r>
           </w:p>
         </w:tc>
         <w:tc>
           <w:tcPr>
-            <w:tcW w:type="dxa" w:w="5669"/>
+            <w:tcW w:type="dxa" w:w="5613"/>
           </w:tcPr>
           <w:p>
             <w:r>
@@ -1252,7 +1252,7 @@
                 <w:b w:val="0"/>
                 <w:sz w:val="18"/>
               </w:rPr>
-              <w:t>ETA São Sebastião do Alto; ETA Valão do Barro; Loja de Atendimento São Sebastião do Alto; UT Chácara do Paraíso; UT Hospital</w:t>
+              <w:t>Base Operacional Casimiro; Captação Bacaxá; ETA Rio Bonito; Loja de Atendimento Barra de São João; Loja de Atendimento Rio Bonito; UT Boa Esperança; UT Lavras</w:t>
             </w:r>
           </w:p>
         </w:tc>
@@ -1282,13 +1282,13 @@
                 <w:b w:val="0"/>
                 <w:sz w:val="18"/>
               </w:rPr>
-              <w:t>Lagos e Litoral — Interior</w:t>
+              <w:t>Noroeste Fluminense — Interior</w:t>
             </w:r>
           </w:p>
         </w:tc>
         <w:tc>
           <w:tcPr>
-            <w:tcW w:type="dxa" w:w="680"/>
+            <w:tcW w:type="dxa" w:w="737"/>
           </w:tcPr>
           <w:p>
             <w:r>
@@ -1310,13 +1310,13 @@
                 <w:b w:val="0"/>
                 <w:sz w:val="18"/>
               </w:rPr>
-              <w:t>7</w:t>
+              <w:t>25</w:t>
             </w:r>
           </w:p>
         </w:tc>
         <w:tc>
           <w:tcPr>
-            <w:tcW w:type="dxa" w:w="5669"/>
+            <w:tcW w:type="dxa" w:w="5613"/>
           </w:tcPr>
           <w:p>
             <w:r>
@@ -1324,7 +1324,7 @@
                 <w:b w:val="0"/>
                 <w:sz w:val="18"/>
               </w:rPr>
-              <w:t>Base Operacional Casimiro; Captação Bacaxá; ETA Rio Bonito; Loja de Atendimento Barra de São João; Loja de Atendimento Rio Bonito; UT Boa Esperança; UT Lavras</w:t>
+              <w:t>Captação Miracema; EEAB Paraoquena; ETA Aperibé; ETA Batatal/coronel Teixeira; ETA Cambuci; ETA Distrito Venda das Flores; ETA Jaguarembé; ETA Laranjais; ETA Miracema; ETA Paraíso do Tobias; ETA Portela; ETA Praça João Pessoa; ETA Sede III; ETE Aperibe; ETE Miracema; Eeat/eres Santa Clara; Loja Comercial Cambuci; Loja de Atendimento Aperibé; Loja de Atendimento Miracema; Loja de Atendimento São Francisco do Itabapoana; Sede Admnistrativa Itaocara; Sede Admnistrativa São Sebastião do Alto; UT Gargaú; UT Monte Verde; UT São João do Paraíso</w:t>
             </w:r>
           </w:p>
         </w:tc>
@@ -1354,85 +1354,13 @@
                 <w:b w:val="0"/>
                 <w:sz w:val="18"/>
               </w:rPr>
-              <w:t>Noroeste Fluminense — Interior</w:t>
-            </w:r>
-          </w:p>
-        </w:tc>
-        <w:tc>
-          <w:tcPr>
-            <w:tcW w:type="dxa" w:w="680"/>
-          </w:tcPr>
-          <w:p>
-            <w:r>
-              <w:rPr>
-                <w:b w:val="0"/>
-                <w:sz w:val="18"/>
-              </w:rPr>
-              <w:t>B1</w:t>
-            </w:r>
-          </w:p>
-        </w:tc>
-        <w:tc>
-          <w:tcPr>
-            <w:tcW w:type="dxa" w:w="567"/>
-          </w:tcPr>
-          <w:p>
-            <w:r>
-              <w:rPr>
-                <w:b w:val="0"/>
-                <w:sz w:val="18"/>
-              </w:rPr>
-              <w:t>25</w:t>
-            </w:r>
-          </w:p>
-        </w:tc>
-        <w:tc>
-          <w:tcPr>
-            <w:tcW w:type="dxa" w:w="5669"/>
-          </w:tcPr>
-          <w:p>
-            <w:r>
-              <w:rPr>
-                <w:b w:val="0"/>
-                <w:sz w:val="18"/>
-              </w:rPr>
-              <w:t>Captação Miracema; EEAB Paraoquena; ETA Aperibé; ETA Batatal/coronel Teixeira; ETA Cambuci; ETA Distrito Venda das Flores; ETA Jaguarembé; ETA Laranjais; ETA Miracema; ETA Paraíso do Tobias; ETA Portela; ETA Praça João Pessoa; ETA Sede III; ETE Aperibe; ETE Miracema; Eeat/eres Santa Clara; Loja Comercial Cambuci; Loja de Atendimento Aperibé; Loja de Atendimento Miracema; Loja de Atendimento São Francisco do Itabapoana; Sede Admnistrativa Itaocara; Sede Admnistrativa São Sebastião do Alto; UT Gargaú; UT Monte Verde; UT São João do Paraíso</w:t>
-            </w:r>
-          </w:p>
-        </w:tc>
-      </w:tr>
-      <w:tr>
-        <w:tc>
-          <w:tcPr>
-            <w:tcW w:type="dxa" w:w="1191"/>
-          </w:tcPr>
-          <w:p>
-            <w:r>
-              <w:rPr>
-                <w:b/>
-                <w:sz w:val="18"/>
-              </w:rPr>
-              <w:t>PGRS-AG-19</w:t>
-            </w:r>
-          </w:p>
-        </w:tc>
-        <w:tc>
-          <w:tcPr>
-            <w:tcW w:type="dxa" w:w="2608"/>
-          </w:tcPr>
-          <w:p>
-            <w:r>
-              <w:rPr>
-                <w:b w:val="0"/>
-                <w:sz w:val="18"/>
-              </w:rPr>
               <w:t>Serrana / Centro-Norte — Interior</w:t>
             </w:r>
           </w:p>
         </w:tc>
         <w:tc>
           <w:tcPr>
-            <w:tcW w:type="dxa" w:w="680"/>
+            <w:tcW w:type="dxa" w:w="737"/>
           </w:tcPr>
           <w:p>
             <w:r>
@@ -1460,7 +1388,7 @@
         </w:tc>
         <w:tc>
           <w:tcPr>
-            <w:tcW w:type="dxa" w:w="5669"/>
+            <w:tcW w:type="dxa" w:w="5613"/>
           </w:tcPr>
           <w:p>
             <w:r>
@@ -1498,13 +1426,13 @@
                 <w:b/>
                 <w:sz w:val="18"/>
               </w:rPr>
-              <w:t>19 planos agrupados</w:t>
+              <w:t>18 planos agrupados</w:t>
             </w:r>
           </w:p>
         </w:tc>
         <w:tc>
           <w:tcPr>
-            <w:tcW w:type="dxa" w:w="680"/>
+            <w:tcW w:type="dxa" w:w="737"/>
           </w:tcPr>
           <w:p>
             <w:r>
@@ -1532,7 +1460,7 @@
         </w:tc>
         <w:tc>
           <w:tcPr>
-            <w:tcW w:type="dxa" w:w="5669"/>
+            <w:tcW w:type="dxa" w:w="5613"/>
           </w:tcPr>
           <w:p>
             <w:r>
@@ -1545,6 +1473,15 @@
         </w:tc>
       </w:tr>
     </w:tbl>
+    <w:p>
+      <w:r>
+        <w:rPr>
+          <w:i/>
+          <w:sz w:val="16"/>
+        </w:rPr>
+        <w:t>* Paquetá (EEE Paquetá e EEE Paquetá 5), Bloco 4, incluído no PGRS-AG-06 (Leste Metropolitano, Bloco 1) por decisão operacional — única exceção à regra de não agrupar blocos distintos.</w:t>
+      </w:r>
+    </w:p>
     <w:sectPr>
       <w:pgSz w:w="12240" w:h="15840"/>
       <w:pgMar w:top="1440" w:right="1800" w:bottom="1440" w:left="1800" w:header="720" w:footer="720" w:gutter="0"/>

</xml_diff>